<commit_message>
File changes and writing for Week 3. Didn't complete everything unfortunetly.
</commit_message>
<xml_diff>
--- a/Semester 2/stage03/Stage_3_Lab_Student_Handout.docx
+++ b/Semester 2/stage03/Stage_3_Lab_Student_Handout.docx
@@ -1,6 +1,6 @@
 
 <file path=word/document.xml><?xml version="1.0" encoding="utf-8"?>
-<w:document xmlns:wpc="http://schemas.microsoft.com/office/word/2010/wordprocessingCanvas" xmlns:cx="http://schemas.microsoft.com/office/drawing/2014/chartex" xmlns:cx1="http://schemas.microsoft.com/office/drawing/2015/9/8/chartex" xmlns:cx2="http://schemas.microsoft.com/office/drawing/2015/10/21/chartex" xmlns:cx3="http://schemas.microsoft.com/office/drawing/2016/5/9/chartex" xmlns:cx4="http://schemas.microsoft.com/office/drawing/2016/5/10/chartex" xmlns:cx5="http://schemas.microsoft.com/office/drawing/2016/5/11/chartex" xmlns:cx6="http://schemas.microsoft.com/office/drawing/2016/5/12/chartex" xmlns:cx7="http://schemas.microsoft.com/office/drawing/2016/5/13/chartex" xmlns:cx8="http://schemas.microsoft.com/office/drawing/2016/5/14/chartex" xmlns:mc="http://schemas.openxmlformats.org/markup-compatibility/2006" xmlns:aink="http://schemas.microsoft.com/office/drawing/2016/ink" xmlns:am3d="http://schemas.microsoft.com/office/drawing/2017/model3d" xmlns:o="urn:schemas-microsoft-com:office:office" xmlns:oel="http://schemas.microsoft.com/office/2019/extlst" xmlns:r="http://schemas.openxmlformats.org/officeDocument/2006/relationships" xmlns:m="http://schemas.openxmlformats.org/officeDocument/2006/math" xmlns:v="urn:schemas-microsoft-com:vml" xmlns:wp14="http://schemas.microsoft.com/office/word/2010/wordprocessingDrawing" xmlns:wp="http://schemas.openxmlformats.org/drawingml/2006/wordprocessingDrawing" xmlns:w10="urn:schemas-microsoft-com:office:word" xmlns:w="http://schemas.openxmlformats.org/wordprocessingml/2006/main" xmlns:w14="http://schemas.microsoft.com/office/word/2010/wordml" xmlns:w15="http://schemas.microsoft.com/office/word/2012/wordml" xmlns:w16cei="http://schemas.microsoft.com/office/word/2026/wordml/cei" xmlns:w16cex="http://schemas.microsoft.com/office/word/2018/wordml/cex" xmlns:w16cid="http://schemas.microsoft.com/office/word/2016/wordml/cid" xmlns:w16="http://schemas.microsoft.com/office/word/2018/wordml" xmlns:w16du="http://schemas.microsoft.com/office/word/2023/wordml/word16du" xmlns:w16sdtdh="http://schemas.microsoft.com/office/word/2020/wordml/sdtdatahash" xmlns:w16sdtfl="http://schemas.microsoft.com/office/word/2024/wordml/sdtformatlock" xmlns:w16se="http://schemas.microsoft.com/office/word/2015/wordml/symex" xmlns:wpg="http://schemas.microsoft.com/office/word/2010/wordprocessingGroup" xmlns:wpi="http://schemas.microsoft.com/office/word/2010/wordprocessingInk" xmlns:wne="http://schemas.microsoft.com/office/word/2006/wordml" xmlns:wps="http://schemas.microsoft.com/office/word/2010/wordprocessingShape" mc:Ignorable="w14 w15 w16se w16cid w16 w16cex w16sdtdh w16sdtfl w16du wp14">
+<w:document xmlns:wpc="http://schemas.microsoft.com/office/word/2010/wordprocessingCanvas" xmlns:cx="http://schemas.microsoft.com/office/drawing/2014/chartex" xmlns:cx1="http://schemas.microsoft.com/office/drawing/2015/9/8/chartex" xmlns:cx2="http://schemas.microsoft.com/office/drawing/2015/10/21/chartex" xmlns:cx3="http://schemas.microsoft.com/office/drawing/2016/5/9/chartex" xmlns:cx4="http://schemas.microsoft.com/office/drawing/2016/5/10/chartex" xmlns:cx5="http://schemas.microsoft.com/office/drawing/2016/5/11/chartex" xmlns:cx6="http://schemas.microsoft.com/office/drawing/2016/5/12/chartex" xmlns:cx7="http://schemas.microsoft.com/office/drawing/2016/5/13/chartex" xmlns:cx8="http://schemas.microsoft.com/office/drawing/2016/5/14/chartex" xmlns:mc="http://schemas.openxmlformats.org/markup-compatibility/2006" xmlns:aink="http://schemas.microsoft.com/office/drawing/2016/ink" xmlns:am3d="http://schemas.microsoft.com/office/drawing/2017/model3d" xmlns:o="urn:schemas-microsoft-com:office:office" xmlns:oel="http://schemas.microsoft.com/office/2019/extlst" xmlns:r="http://schemas.openxmlformats.org/officeDocument/2006/relationships" xmlns:m="http://schemas.openxmlformats.org/officeDocument/2006/math" xmlns:v="urn:schemas-microsoft-com:vml" xmlns:wp14="http://schemas.microsoft.com/office/word/2010/wordprocessingDrawing" xmlns:wp="http://schemas.openxmlformats.org/drawingml/2006/wordprocessingDrawing" xmlns:w10="urn:schemas-microsoft-com:office:word" xmlns:w="http://schemas.openxmlformats.org/wordprocessingml/2006/main" xmlns:w14="http://schemas.microsoft.com/office/word/2010/wordml" xmlns:w15="http://schemas.microsoft.com/office/word/2012/wordml" xmlns:w16cex="http://schemas.microsoft.com/office/word/2018/wordml/cex" xmlns:w16cid="http://schemas.microsoft.com/office/word/2016/wordml/cid" xmlns:w16="http://schemas.microsoft.com/office/word/2018/wordml" xmlns:w16du="http://schemas.microsoft.com/office/word/2023/wordml/word16du" xmlns:w16sdtdh="http://schemas.microsoft.com/office/word/2020/wordml/sdtdatahash" xmlns:w16sdtfl="http://schemas.microsoft.com/office/word/2024/wordml/sdtformatlock" xmlns:w16se="http://schemas.microsoft.com/office/word/2015/wordml/symex" xmlns:wpg="http://schemas.microsoft.com/office/word/2010/wordprocessingGroup" xmlns:wpi="http://schemas.microsoft.com/office/word/2010/wordprocessingInk" xmlns:wne="http://schemas.microsoft.com/office/word/2006/wordml" xmlns:wps="http://schemas.microsoft.com/office/word/2010/wordprocessingShape" mc:Ignorable="w14 w15 w16se w16cid w16 w16cex w16sdtdh w16sdtfl w16du wp14">
   <w:body>
     <w:p>
       <w:pPr>
@@ -63,94 +63,2344 @@
       </w:r>
     </w:p>
     <w:p>
-      <w:pPr>
-        <w:pStyle w:val="Heading1"/>
-      </w:pPr>
-      <w:r>
-        <w:t>B - Candidate Classes</w:t>
+      <w:r>
+        <w:t>Nouns:</w:t>
       </w:r>
     </w:p>
     <w:p>
-      <w:r>
-        <w:t>Record candidate concepts, supporting requirements, state and behaviour.</w:t>
+      <w:pPr>
+        <w:pStyle w:val="ListParagraph"/>
+        <w:numPr>
+          <w:ilvl w:val="0"/>
+          <w:numId w:val="10"/>
+        </w:numPr>
+      </w:pPr>
+      <w:r>
+        <w:t>Patient</w:t>
       </w:r>
     </w:p>
     <w:p>
       <w:pPr>
-        <w:pStyle w:val="Heading1"/>
-      </w:pPr>
-      <w:r>
-        <w:t>C - CRC Cards</w:t>
+        <w:pStyle w:val="ListParagraph"/>
+        <w:numPr>
+          <w:ilvl w:val="0"/>
+          <w:numId w:val="10"/>
+        </w:numPr>
+      </w:pPr>
+      <w:r>
+        <w:t>Doctor</w:t>
       </w:r>
     </w:p>
     <w:p>
-      <w:r>
-        <w:t>Create CRC cards for Patient, Practitioner and Appointment.</w:t>
+      <w:pPr>
+        <w:pStyle w:val="ListParagraph"/>
+        <w:numPr>
+          <w:ilvl w:val="0"/>
+          <w:numId w:val="10"/>
+        </w:numPr>
+      </w:pPr>
+      <w:r>
+        <w:t>Management</w:t>
       </w:r>
     </w:p>
     <w:p>
       <w:pPr>
-        <w:pStyle w:val="Heading1"/>
-      </w:pPr>
-      <w:r>
-        <w:t>D - UML Model</w:t>
+        <w:pStyle w:val="ListParagraph"/>
+        <w:numPr>
+          <w:ilvl w:val="0"/>
+          <w:numId w:val="10"/>
+        </w:numPr>
+      </w:pPr>
+      <w:r>
+        <w:t>SmartCare Community Clinic Staff Member</w:t>
       </w:r>
     </w:p>
     <w:p>
-      <w:r>
-        <w:t>Draw classes, attributes, operations, associations and multiplicities.</w:t>
+      <w:pPr>
+        <w:pStyle w:val="ListParagraph"/>
+        <w:numPr>
+          <w:ilvl w:val="0"/>
+          <w:numId w:val="10"/>
+        </w:numPr>
+      </w:pPr>
+      <w:r>
+        <w:t>Hospital</w:t>
       </w:r>
     </w:p>
     <w:p>
-      <w:pPr>
-        <w:pStyle w:val="Heading1"/>
-      </w:pPr>
-      <w:r>
-        <w:t>E - AI Design Review</w:t>
+      <w:r>
+        <w:t>Verbs:</w:t>
       </w:r>
     </w:p>
     <w:p>
-      <w:r>
-        <w:t>Ask AI to suggest classes and relationships using only confirmed requirements; require supporting requirement IDs.</w:t>
+      <w:pPr>
+        <w:pStyle w:val="ListParagraph"/>
+        <w:numPr>
+          <w:ilvl w:val="0"/>
+          <w:numId w:val="10"/>
+        </w:numPr>
+      </w:pPr>
+      <w:r>
+        <w:t>Create</w:t>
       </w:r>
     </w:p>
     <w:p>
       <w:pPr>
-        <w:pStyle w:val="Heading1"/>
-      </w:pPr>
-      <w:r>
-        <w:t>F - Compare and Decide</w:t>
+        <w:pStyle w:val="ListParagraph"/>
+        <w:numPr>
+          <w:ilvl w:val="0"/>
+          <w:numId w:val="10"/>
+        </w:numPr>
+      </w:pPr>
+      <w:r>
+        <w:t>Store</w:t>
       </w:r>
     </w:p>
     <w:p>
-      <w:r>
-        <w:t>Record at least one accepted, modified and rejected AI suggestion.</w:t>
+      <w:pPr>
+        <w:pStyle w:val="ListParagraph"/>
+        <w:numPr>
+          <w:ilvl w:val="0"/>
+          <w:numId w:val="10"/>
+        </w:numPr>
+      </w:pPr>
+      <w:r>
+        <w:t>Retrieve</w:t>
       </w:r>
     </w:p>
     <w:p>
       <w:pPr>
-        <w:pStyle w:val="Heading1"/>
-      </w:pPr>
-      <w:r>
-        <w:t>G - Python Skeletons</w:t>
+        <w:pStyle w:val="ListParagraph"/>
+        <w:numPr>
+          <w:ilvl w:val="0"/>
+          <w:numId w:val="10"/>
+        </w:numPr>
+      </w:pPr>
+      <w:r>
+        <w:t>View</w:t>
       </w:r>
     </w:p>
     <w:p>
-      <w:r>
-        <w:t>Create simple Patient, Practitioner and Appointment class skeletons.</w:t>
+      <w:pPr>
+        <w:pStyle w:val="ListParagraph"/>
+        <w:numPr>
+          <w:ilvl w:val="0"/>
+          <w:numId w:val="10"/>
+        </w:numPr>
+      </w:pPr>
+      <w:r>
+        <w:t>Sort</w:t>
       </w:r>
     </w:p>
     <w:p>
       <w:pPr>
-        <w:pStyle w:val="Heading1"/>
-      </w:pPr>
-      <w:r>
-        <w:t>H - Consistency Check</w:t>
+        <w:pStyle w:val="ListParagraph"/>
+        <w:numPr>
+          <w:ilvl w:val="0"/>
+          <w:numId w:val="10"/>
+        </w:numPr>
+      </w:pPr>
+      <w:r>
+        <w:t>Delete</w:t>
       </w:r>
     </w:p>
     <w:p>
-      <w:r>
-        <w:t>Check model-code consistency; do not implement full behaviour yet.</w:t>
+      <w:pPr>
+        <w:pStyle w:val="ListParagraph"/>
+        <w:numPr>
+          <w:ilvl w:val="0"/>
+          <w:numId w:val="10"/>
+        </w:numPr>
+      </w:pPr>
+      <w:r>
+        <w:t>Edit</w:t>
+      </w:r>
+    </w:p>
+    <w:p>
+      <w:pPr>
+        <w:pStyle w:val="ListParagraph"/>
+        <w:numPr>
+          <w:ilvl w:val="0"/>
+          <w:numId w:val="10"/>
+        </w:numPr>
+      </w:pPr>
+      <w:r>
+        <w:t>Search</w:t>
+      </w:r>
+    </w:p>
+    <w:p>
+      <w:r>
+        <w:t>B</w:t>
+      </w:r>
+      <w:r>
+        <w:t>usiness rules</w:t>
+      </w:r>
+      <w:r>
+        <w:t>:</w:t>
+      </w:r>
+    </w:p>
+    <w:p>
+      <w:pPr>
+        <w:pStyle w:val="ListParagraph"/>
+        <w:numPr>
+          <w:ilvl w:val="0"/>
+          <w:numId w:val="10"/>
+        </w:numPr>
+      </w:pPr>
+      <w:r>
+        <w:t>Only collect and store data that is required for the system to work</w:t>
+      </w:r>
+    </w:p>
+    <w:p>
+      <w:pPr>
+        <w:pStyle w:val="ListParagraph"/>
+        <w:numPr>
+          <w:ilvl w:val="0"/>
+          <w:numId w:val="10"/>
+        </w:numPr>
+      </w:pPr>
+      <w:r>
+        <w:t xml:space="preserve">Uphold data security and have safe data management </w:t>
+      </w:r>
+      <w:r>
+        <w:t>systems in place</w:t>
+      </w:r>
+    </w:p>
+    <w:p>
+      <w:pPr>
+        <w:pStyle w:val="Heading1"/>
+      </w:pPr>
+      <w:r>
+        <w:t>B</w:t>
+      </w:r>
+      <w:r>
+        <w:t xml:space="preserve"> - Candidate Classes</w:t>
+      </w:r>
+    </w:p>
+    <w:p>
+      <w:r>
+        <w:t xml:space="preserve">Record candidate concepts, supporting requirements, state and </w:t>
+      </w:r>
+      <w:proofErr w:type="spellStart"/>
+      <w:r>
+        <w:t>behaviour</w:t>
+      </w:r>
+      <w:proofErr w:type="spellEnd"/>
+      <w:r>
+        <w:t>.</w:t>
+      </w:r>
+    </w:p>
+    <w:p>
+      <w:pPr>
+        <w:pStyle w:val="Heading1"/>
+      </w:pPr>
+      <w:r>
+        <w:t>C - CRC Cards</w:t>
+      </w:r>
+    </w:p>
+    <w:p>
+      <w:pPr>
+        <w:rPr>
+          <w:color w:val="EE0000"/>
+        </w:rPr>
+      </w:pPr>
+      <w:r>
+        <w:rPr>
+          <w:color w:val="EE0000"/>
+        </w:rPr>
+        <w:t>Create CRC cards for Patient, Practitioner and Appointment.</w:t>
+      </w:r>
+    </w:p>
+    <w:p>
+      <w:pPr>
+        <w:pStyle w:val="Heading2"/>
+      </w:pPr>
+      <w:r>
+        <w:t>Patient</w:t>
+      </w:r>
+    </w:p>
+    <w:tbl>
+      <w:tblPr>
+        <w:tblStyle w:val="TableGrid"/>
+        <w:tblW w:w="0" w:type="auto"/>
+        <w:tblLook w:val="04A0" w:firstRow="1" w:lastRow="0" w:firstColumn="1" w:lastColumn="0" w:noHBand="0" w:noVBand="1"/>
+      </w:tblPr>
+      <w:tblGrid>
+        <w:gridCol w:w="5040"/>
+        <w:gridCol w:w="5040"/>
+      </w:tblGrid>
+      <w:tr>
+        <w:tc>
+          <w:tcPr>
+            <w:tcW w:w="5040" w:type="dxa"/>
+          </w:tcPr>
+          <w:p>
+            <w:r>
+              <w:t>Responsibilities</w:t>
+            </w:r>
+          </w:p>
+        </w:tc>
+        <w:tc>
+          <w:tcPr>
+            <w:tcW w:w="5040" w:type="dxa"/>
+          </w:tcPr>
+          <w:p>
+            <w:r>
+              <w:t>Collaborators</w:t>
+            </w:r>
+          </w:p>
+        </w:tc>
+      </w:tr>
+      <w:tr>
+        <w:tc>
+          <w:tcPr>
+            <w:tcW w:w="5040" w:type="dxa"/>
+          </w:tcPr>
+          <w:p>
+            <w:r>
+              <w:t>Check if they have an appointment scheduled</w:t>
+            </w:r>
+          </w:p>
+        </w:tc>
+        <w:tc>
+          <w:tcPr>
+            <w:tcW w:w="5040" w:type="dxa"/>
+          </w:tcPr>
+          <w:p>
+            <w:r>
+              <w:t>Practitioner</w:t>
+            </w:r>
+          </w:p>
+        </w:tc>
+      </w:tr>
+      <w:tr>
+        <w:tc>
+          <w:tcPr>
+            <w:tcW w:w="5040" w:type="dxa"/>
+          </w:tcPr>
+          <w:p>
+            <w:r>
+              <w:lastRenderedPageBreak/>
+              <w:t>Check if they are available for an appointment</w:t>
+            </w:r>
+          </w:p>
+        </w:tc>
+        <w:tc>
+          <w:tcPr>
+            <w:tcW w:w="5040" w:type="dxa"/>
+          </w:tcPr>
+          <w:p>
+            <w:r>
+              <w:t>Appointment</w:t>
+            </w:r>
+          </w:p>
+        </w:tc>
+      </w:tr>
+    </w:tbl>
+    <w:p>
+      <w:pPr>
+        <w:pStyle w:val="Heading2"/>
+      </w:pPr>
+      <w:r>
+        <w:t>Practitioner</w:t>
+      </w:r>
+    </w:p>
+    <w:tbl>
+      <w:tblPr>
+        <w:tblStyle w:val="TableGrid"/>
+        <w:tblW w:w="0" w:type="auto"/>
+        <w:tblLook w:val="04A0" w:firstRow="1" w:lastRow="0" w:firstColumn="1" w:lastColumn="0" w:noHBand="0" w:noVBand="1"/>
+      </w:tblPr>
+      <w:tblGrid>
+        <w:gridCol w:w="5040"/>
+        <w:gridCol w:w="5040"/>
+      </w:tblGrid>
+      <w:tr>
+        <w:tc>
+          <w:tcPr>
+            <w:tcW w:w="5040" w:type="dxa"/>
+          </w:tcPr>
+          <w:p>
+            <w:r>
+              <w:t>Responsibilities</w:t>
+            </w:r>
+          </w:p>
+        </w:tc>
+        <w:tc>
+          <w:tcPr>
+            <w:tcW w:w="5040" w:type="dxa"/>
+          </w:tcPr>
+          <w:p>
+            <w:r>
+              <w:t>Collaborators</w:t>
+            </w:r>
+          </w:p>
+        </w:tc>
+      </w:tr>
+      <w:tr>
+        <w:tc>
+          <w:tcPr>
+            <w:tcW w:w="5040" w:type="dxa"/>
+          </w:tcPr>
+          <w:p>
+            <w:r>
+              <w:t>Check if they have an appointment scheduled</w:t>
+            </w:r>
+          </w:p>
+        </w:tc>
+        <w:tc>
+          <w:tcPr>
+            <w:tcW w:w="5040" w:type="dxa"/>
+          </w:tcPr>
+          <w:p>
+            <w:r>
+              <w:t>Patient</w:t>
+            </w:r>
+          </w:p>
+        </w:tc>
+      </w:tr>
+      <w:tr>
+        <w:tc>
+          <w:tcPr>
+            <w:tcW w:w="5040" w:type="dxa"/>
+          </w:tcPr>
+          <w:p>
+            <w:r>
+              <w:t>Check if they are available for an appointment at a certain time</w:t>
+            </w:r>
+          </w:p>
+        </w:tc>
+        <w:tc>
+          <w:tcPr>
+            <w:tcW w:w="5040" w:type="dxa"/>
+          </w:tcPr>
+          <w:p>
+            <w:r>
+              <w:t>Appointment</w:t>
+            </w:r>
+          </w:p>
+        </w:tc>
+      </w:tr>
+    </w:tbl>
+    <w:p>
+      <w:pPr>
+        <w:pStyle w:val="Heading2"/>
+      </w:pPr>
+      <w:r>
+        <w:t>Appointment</w:t>
+      </w:r>
+    </w:p>
+    <w:tbl>
+      <w:tblPr>
+        <w:tblStyle w:val="TableGrid"/>
+        <w:tblW w:w="0" w:type="auto"/>
+        <w:tblLook w:val="04A0" w:firstRow="1" w:lastRow="0" w:firstColumn="1" w:lastColumn="0" w:noHBand="0" w:noVBand="1"/>
+      </w:tblPr>
+      <w:tblGrid>
+        <w:gridCol w:w="5040"/>
+        <w:gridCol w:w="5040"/>
+      </w:tblGrid>
+      <w:tr>
+        <w:tc>
+          <w:tcPr>
+            <w:tcW w:w="5040" w:type="dxa"/>
+          </w:tcPr>
+          <w:p>
+            <w:r>
+              <w:t>Responsibilities</w:t>
+            </w:r>
+          </w:p>
+        </w:tc>
+        <w:tc>
+          <w:tcPr>
+            <w:tcW w:w="5040" w:type="dxa"/>
+          </w:tcPr>
+          <w:p>
+            <w:r>
+              <w:t>Collaborators</w:t>
+            </w:r>
+          </w:p>
+        </w:tc>
+      </w:tr>
+      <w:tr>
+        <w:tc>
+          <w:tcPr>
+            <w:tcW w:w="5040" w:type="dxa"/>
+          </w:tcPr>
+          <w:p>
+            <w:r>
+              <w:t xml:space="preserve">Check if </w:t>
+            </w:r>
+            <w:proofErr w:type="gramStart"/>
+            <w:r>
+              <w:t>patient</w:t>
+            </w:r>
+            <w:proofErr w:type="gramEnd"/>
+            <w:r>
+              <w:t xml:space="preserve"> and </w:t>
+            </w:r>
+            <w:proofErr w:type="gramStart"/>
+            <w:r>
+              <w:t>practitioner</w:t>
+            </w:r>
+            <w:proofErr w:type="gramEnd"/>
+            <w:r>
+              <w:t xml:space="preserve"> are available</w:t>
+            </w:r>
+          </w:p>
+        </w:tc>
+        <w:tc>
+          <w:tcPr>
+            <w:tcW w:w="5040" w:type="dxa"/>
+          </w:tcPr>
+          <w:p>
+            <w:r>
+              <w:t>Patient</w:t>
+            </w:r>
+          </w:p>
+        </w:tc>
+      </w:tr>
+      <w:tr>
+        <w:tc>
+          <w:tcPr>
+            <w:tcW w:w="5040" w:type="dxa"/>
+          </w:tcPr>
+          <w:p>
+            <w:r>
+              <w:t>Calculate appointment cost (if any)</w:t>
+            </w:r>
+          </w:p>
+        </w:tc>
+        <w:tc>
+          <w:tcPr>
+            <w:tcW w:w="5040" w:type="dxa"/>
+          </w:tcPr>
+          <w:p>
+            <w:r>
+              <w:t>Practitioner</w:t>
+            </w:r>
+          </w:p>
+        </w:tc>
+      </w:tr>
+    </w:tbl>
+    <w:p/>
+    <w:p>
+      <w:pPr>
+        <w:pStyle w:val="Heading1"/>
+      </w:pPr>
+      <w:r>
+        <w:t>D - UML Model</w:t>
+      </w:r>
+    </w:p>
+    <w:p>
+      <w:r>
+        <w:t>Draw classes, attributes, operations, associations and multiplicities.</w:t>
+      </w:r>
+    </w:p>
+    <w:p>
+      <w:r>
+        <w:rPr>
+          <w:noProof/>
+        </w:rPr>
+        <w:lastRenderedPageBreak/>
+        <w:drawing>
+          <wp:inline distT="0" distB="0" distL="0" distR="0" wp14:anchorId="10C8684E" wp14:editId="0E59E09E">
+            <wp:extent cx="6400800" cy="8855075"/>
+            <wp:effectExtent l="0" t="0" r="0" b="3175"/>
+            <wp:docPr id="1166774343" name="Picture 1"/>
+            <wp:cNvGraphicFramePr>
+              <a:graphicFrameLocks xmlns:a="http://schemas.openxmlformats.org/drawingml/2006/main" noChangeAspect="1"/>
+            </wp:cNvGraphicFramePr>
+            <a:graphic xmlns:a="http://schemas.openxmlformats.org/drawingml/2006/main">
+              <a:graphicData uri="http://schemas.openxmlformats.org/drawingml/2006/picture">
+                <pic:pic xmlns:pic="http://schemas.openxmlformats.org/drawingml/2006/picture">
+                  <pic:nvPicPr>
+                    <pic:cNvPr id="1166774343" name=""/>
+                    <pic:cNvPicPr/>
+                  </pic:nvPicPr>
+                  <pic:blipFill>
+                    <a:blip r:embed="rId6"/>
+                    <a:stretch>
+                      <a:fillRect/>
+                    </a:stretch>
+                  </pic:blipFill>
+                  <pic:spPr>
+                    <a:xfrm>
+                      <a:off x="0" y="0"/>
+                      <a:ext cx="6400800" cy="8855075"/>
+                    </a:xfrm>
+                    <a:prstGeom prst="rect">
+                      <a:avLst/>
+                    </a:prstGeom>
+                  </pic:spPr>
+                </pic:pic>
+              </a:graphicData>
+            </a:graphic>
+          </wp:inline>
+        </w:drawing>
+      </w:r>
+    </w:p>
+    <w:p>
+      <w:pPr>
+        <w:pStyle w:val="Heading1"/>
+      </w:pPr>
+      <w:r>
+        <w:lastRenderedPageBreak/>
+        <w:t>E - AI Design Review</w:t>
+      </w:r>
+    </w:p>
+    <w:p>
+      <w:r>
+        <w:t>Ask AI to suggest classes and relationships using only confirmed requirements; require supporting requirement IDs.</w:t>
+      </w:r>
+    </w:p>
+    <w:p>
+      <w:pPr>
+        <w:pStyle w:val="Heading1"/>
+      </w:pPr>
+      <w:r>
+        <w:t>F - Compare and Decide</w:t>
+      </w:r>
+    </w:p>
+    <w:p>
+      <w:r>
+        <w:t>Record at least one accepted, modified and rejected AI suggestion.</w:t>
+      </w:r>
+    </w:p>
+    <w:p>
+      <w:pPr>
+        <w:pStyle w:val="Heading1"/>
+      </w:pPr>
+      <w:r>
+        <w:t>G - Python Skeletons</w:t>
+      </w:r>
+    </w:p>
+    <w:p>
+      <w:pPr>
+        <w:rPr>
+          <w:color w:val="EE0000"/>
+        </w:rPr>
+      </w:pPr>
+      <w:r>
+        <w:rPr>
+          <w:color w:val="EE0000"/>
+        </w:rPr>
+        <w:t>Create simple Patient, Practitioner and Appointment class skeletons.</w:t>
+      </w:r>
+    </w:p>
+    <w:p>
+      <w:pPr>
+        <w:rPr>
+          <w:lang w:val="en-AU"/>
+        </w:rPr>
+      </w:pPr>
+      <w:r>
+        <w:rPr>
+          <w:lang w:val="en-AU"/>
+        </w:rPr>
+        <w:t>class Patient:</w:t>
+      </w:r>
+    </w:p>
+    <w:p>
+      <w:pPr>
+        <w:rPr>
+          <w:lang w:val="en-AU"/>
+        </w:rPr>
+      </w:pPr>
+      <w:r>
+        <w:rPr>
+          <w:lang w:val="en-AU"/>
+        </w:rPr>
+        <w:t>    def __</w:t>
+      </w:r>
+      <w:proofErr w:type="spellStart"/>
+      <w:r>
+        <w:rPr>
+          <w:lang w:val="en-AU"/>
+        </w:rPr>
+        <w:t>init</w:t>
+      </w:r>
+      <w:proofErr w:type="spellEnd"/>
+      <w:r>
+        <w:rPr>
+          <w:lang w:val="en-AU"/>
+        </w:rPr>
+        <w:t>_</w:t>
+      </w:r>
+      <w:proofErr w:type="gramStart"/>
+      <w:r>
+        <w:rPr>
+          <w:lang w:val="en-AU"/>
+        </w:rPr>
+        <w:t>_(</w:t>
+      </w:r>
+      <w:proofErr w:type="gramEnd"/>
+      <w:r>
+        <w:rPr>
+          <w:lang w:val="en-AU"/>
+        </w:rPr>
+        <w:t xml:space="preserve">self, </w:t>
+      </w:r>
+      <w:proofErr w:type="spellStart"/>
+      <w:r>
+        <w:rPr>
+          <w:lang w:val="en-AU"/>
+        </w:rPr>
+        <w:t>firstName</w:t>
+      </w:r>
+      <w:proofErr w:type="spellEnd"/>
+      <w:r>
+        <w:rPr>
+          <w:lang w:val="en-AU"/>
+        </w:rPr>
+        <w:t xml:space="preserve">, </w:t>
+      </w:r>
+      <w:proofErr w:type="spellStart"/>
+      <w:r>
+        <w:rPr>
+          <w:lang w:val="en-AU"/>
+        </w:rPr>
+        <w:t>lastName</w:t>
+      </w:r>
+      <w:proofErr w:type="spellEnd"/>
+      <w:r>
+        <w:rPr>
+          <w:lang w:val="en-AU"/>
+        </w:rPr>
+        <w:t xml:space="preserve">, email, </w:t>
+      </w:r>
+      <w:proofErr w:type="spellStart"/>
+      <w:r>
+        <w:rPr>
+          <w:lang w:val="en-AU"/>
+        </w:rPr>
+        <w:t>phoneNumber</w:t>
+      </w:r>
+      <w:proofErr w:type="spellEnd"/>
+      <w:r>
+        <w:rPr>
+          <w:lang w:val="en-AU"/>
+        </w:rPr>
+        <w:t xml:space="preserve">, </w:t>
+      </w:r>
+      <w:proofErr w:type="spellStart"/>
+      <w:r>
+        <w:rPr>
+          <w:lang w:val="en-AU"/>
+        </w:rPr>
+        <w:t>streetNumber</w:t>
+      </w:r>
+      <w:proofErr w:type="spellEnd"/>
+      <w:r>
+        <w:rPr>
+          <w:lang w:val="en-AU"/>
+        </w:rPr>
+        <w:t xml:space="preserve">, </w:t>
+      </w:r>
+      <w:proofErr w:type="spellStart"/>
+      <w:r>
+        <w:rPr>
+          <w:lang w:val="en-AU"/>
+        </w:rPr>
+        <w:t>streetName</w:t>
+      </w:r>
+      <w:proofErr w:type="spellEnd"/>
+      <w:r>
+        <w:rPr>
+          <w:lang w:val="en-AU"/>
+        </w:rPr>
+        <w:t>, suburb, postcode, city, state):</w:t>
+      </w:r>
+    </w:p>
+    <w:p>
+      <w:pPr>
+        <w:rPr>
+          <w:lang w:val="en-AU"/>
+        </w:rPr>
+      </w:pPr>
+      <w:r>
+        <w:rPr>
+          <w:lang w:val="en-AU"/>
+        </w:rPr>
+        <w:t>        self.id = 0</w:t>
+      </w:r>
+    </w:p>
+    <w:p>
+      <w:pPr>
+        <w:rPr>
+          <w:lang w:val="en-AU"/>
+        </w:rPr>
+      </w:pPr>
+      <w:r>
+        <w:rPr>
+          <w:lang w:val="en-AU"/>
+        </w:rPr>
+        <w:t xml:space="preserve">        </w:t>
+      </w:r>
+      <w:proofErr w:type="spellStart"/>
+      <w:proofErr w:type="gramStart"/>
+      <w:r>
+        <w:rPr>
+          <w:lang w:val="en-AU"/>
+        </w:rPr>
+        <w:t>self.firstName</w:t>
+      </w:r>
+      <w:proofErr w:type="spellEnd"/>
+      <w:proofErr w:type="gramEnd"/>
+      <w:r>
+        <w:rPr>
+          <w:lang w:val="en-AU"/>
+        </w:rPr>
+        <w:t xml:space="preserve"> = </w:t>
+      </w:r>
+      <w:proofErr w:type="spellStart"/>
+      <w:r>
+        <w:rPr>
+          <w:lang w:val="en-AU"/>
+        </w:rPr>
+        <w:t>firstName</w:t>
+      </w:r>
+      <w:proofErr w:type="spellEnd"/>
+    </w:p>
+    <w:p>
+      <w:pPr>
+        <w:rPr>
+          <w:lang w:val="en-AU"/>
+        </w:rPr>
+      </w:pPr>
+      <w:r>
+        <w:rPr>
+          <w:lang w:val="en-AU"/>
+        </w:rPr>
+        <w:t xml:space="preserve">        </w:t>
+      </w:r>
+      <w:proofErr w:type="spellStart"/>
+      <w:proofErr w:type="gramStart"/>
+      <w:r>
+        <w:rPr>
+          <w:lang w:val="en-AU"/>
+        </w:rPr>
+        <w:t>self.lastName</w:t>
+      </w:r>
+      <w:proofErr w:type="spellEnd"/>
+      <w:proofErr w:type="gramEnd"/>
+      <w:r>
+        <w:rPr>
+          <w:lang w:val="en-AU"/>
+        </w:rPr>
+        <w:t xml:space="preserve"> = </w:t>
+      </w:r>
+      <w:proofErr w:type="spellStart"/>
+      <w:r>
+        <w:rPr>
+          <w:lang w:val="en-AU"/>
+        </w:rPr>
+        <w:t>lastName</w:t>
+      </w:r>
+      <w:proofErr w:type="spellEnd"/>
+    </w:p>
+    <w:p>
+      <w:pPr>
+        <w:rPr>
+          <w:lang w:val="en-AU"/>
+        </w:rPr>
+      </w:pPr>
+      <w:r>
+        <w:rPr>
+          <w:lang w:val="en-AU"/>
+        </w:rPr>
+        <w:t xml:space="preserve">        </w:t>
+      </w:r>
+      <w:proofErr w:type="spellStart"/>
+      <w:proofErr w:type="gramStart"/>
+      <w:r>
+        <w:rPr>
+          <w:lang w:val="en-AU"/>
+        </w:rPr>
+        <w:t>self.email</w:t>
+      </w:r>
+      <w:proofErr w:type="spellEnd"/>
+      <w:proofErr w:type="gramEnd"/>
+      <w:r>
+        <w:rPr>
+          <w:lang w:val="en-AU"/>
+        </w:rPr>
+        <w:t xml:space="preserve"> = email</w:t>
+      </w:r>
+    </w:p>
+    <w:p>
+      <w:pPr>
+        <w:rPr>
+          <w:lang w:val="en-AU"/>
+        </w:rPr>
+      </w:pPr>
+      <w:r>
+        <w:rPr>
+          <w:lang w:val="en-AU"/>
+        </w:rPr>
+        <w:t xml:space="preserve">        </w:t>
+      </w:r>
+      <w:proofErr w:type="spellStart"/>
+      <w:proofErr w:type="gramStart"/>
+      <w:r>
+        <w:rPr>
+          <w:lang w:val="en-AU"/>
+        </w:rPr>
+        <w:t>self.phoneNumber</w:t>
+      </w:r>
+      <w:proofErr w:type="spellEnd"/>
+      <w:proofErr w:type="gramEnd"/>
+      <w:r>
+        <w:rPr>
+          <w:lang w:val="en-AU"/>
+        </w:rPr>
+        <w:t xml:space="preserve"> = </w:t>
+      </w:r>
+      <w:proofErr w:type="spellStart"/>
+      <w:r>
+        <w:rPr>
+          <w:lang w:val="en-AU"/>
+        </w:rPr>
+        <w:t>phoneNumber</w:t>
+      </w:r>
+      <w:proofErr w:type="spellEnd"/>
+    </w:p>
+    <w:p>
+      <w:pPr>
+        <w:rPr>
+          <w:lang w:val="en-AU"/>
+        </w:rPr>
+      </w:pPr>
+      <w:r>
+        <w:rPr>
+          <w:lang w:val="en-AU"/>
+        </w:rPr>
+        <w:t xml:space="preserve">        </w:t>
+      </w:r>
+      <w:proofErr w:type="spellStart"/>
+      <w:proofErr w:type="gramStart"/>
+      <w:r>
+        <w:rPr>
+          <w:lang w:val="en-AU"/>
+        </w:rPr>
+        <w:t>self.streetNumber</w:t>
+      </w:r>
+      <w:proofErr w:type="spellEnd"/>
+      <w:proofErr w:type="gramEnd"/>
+      <w:r>
+        <w:rPr>
+          <w:lang w:val="en-AU"/>
+        </w:rPr>
+        <w:t xml:space="preserve"> = </w:t>
+      </w:r>
+      <w:proofErr w:type="spellStart"/>
+      <w:r>
+        <w:rPr>
+          <w:lang w:val="en-AU"/>
+        </w:rPr>
+        <w:t>streetNumber</w:t>
+      </w:r>
+      <w:proofErr w:type="spellEnd"/>
+    </w:p>
+    <w:p>
+      <w:pPr>
+        <w:rPr>
+          <w:lang w:val="en-AU"/>
+        </w:rPr>
+      </w:pPr>
+      <w:r>
+        <w:rPr>
+          <w:lang w:val="en-AU"/>
+        </w:rPr>
+        <w:t xml:space="preserve">        </w:t>
+      </w:r>
+      <w:proofErr w:type="spellStart"/>
+      <w:proofErr w:type="gramStart"/>
+      <w:r>
+        <w:rPr>
+          <w:lang w:val="en-AU"/>
+        </w:rPr>
+        <w:t>self.streetName</w:t>
+      </w:r>
+      <w:proofErr w:type="spellEnd"/>
+      <w:proofErr w:type="gramEnd"/>
+      <w:r>
+        <w:rPr>
+          <w:lang w:val="en-AU"/>
+        </w:rPr>
+        <w:t xml:space="preserve"> = </w:t>
+      </w:r>
+      <w:proofErr w:type="spellStart"/>
+      <w:r>
+        <w:rPr>
+          <w:lang w:val="en-AU"/>
+        </w:rPr>
+        <w:t>streetName</w:t>
+      </w:r>
+      <w:proofErr w:type="spellEnd"/>
+    </w:p>
+    <w:p>
+      <w:pPr>
+        <w:rPr>
+          <w:lang w:val="en-AU"/>
+        </w:rPr>
+      </w:pPr>
+      <w:r>
+        <w:rPr>
+          <w:lang w:val="en-AU"/>
+        </w:rPr>
+        <w:t xml:space="preserve">        </w:t>
+      </w:r>
+      <w:proofErr w:type="spellStart"/>
+      <w:proofErr w:type="gramStart"/>
+      <w:r>
+        <w:rPr>
+          <w:lang w:val="en-AU"/>
+        </w:rPr>
+        <w:t>self.suburb</w:t>
+      </w:r>
+      <w:proofErr w:type="spellEnd"/>
+      <w:proofErr w:type="gramEnd"/>
+      <w:r>
+        <w:rPr>
+          <w:lang w:val="en-AU"/>
+        </w:rPr>
+        <w:t xml:space="preserve"> = suburb</w:t>
+      </w:r>
+    </w:p>
+    <w:p>
+      <w:pPr>
+        <w:rPr>
+          <w:lang w:val="en-AU"/>
+        </w:rPr>
+      </w:pPr>
+      <w:r>
+        <w:rPr>
+          <w:lang w:val="en-AU"/>
+        </w:rPr>
+        <w:t xml:space="preserve">        </w:t>
+      </w:r>
+      <w:proofErr w:type="spellStart"/>
+      <w:proofErr w:type="gramStart"/>
+      <w:r>
+        <w:rPr>
+          <w:lang w:val="en-AU"/>
+        </w:rPr>
+        <w:t>self.postcode</w:t>
+      </w:r>
+      <w:proofErr w:type="spellEnd"/>
+      <w:proofErr w:type="gramEnd"/>
+      <w:r>
+        <w:rPr>
+          <w:lang w:val="en-AU"/>
+        </w:rPr>
+        <w:t xml:space="preserve"> = postcode</w:t>
+      </w:r>
+    </w:p>
+    <w:p>
+      <w:pPr>
+        <w:rPr>
+          <w:lang w:val="en-AU"/>
+        </w:rPr>
+      </w:pPr>
+      <w:r>
+        <w:rPr>
+          <w:lang w:val="en-AU"/>
+        </w:rPr>
+        <w:t xml:space="preserve">        </w:t>
+      </w:r>
+      <w:proofErr w:type="spellStart"/>
+      <w:proofErr w:type="gramStart"/>
+      <w:r>
+        <w:rPr>
+          <w:lang w:val="en-AU"/>
+        </w:rPr>
+        <w:t>self.city</w:t>
+      </w:r>
+      <w:proofErr w:type="spellEnd"/>
+      <w:proofErr w:type="gramEnd"/>
+      <w:r>
+        <w:rPr>
+          <w:lang w:val="en-AU"/>
+        </w:rPr>
+        <w:t xml:space="preserve"> = city</w:t>
+      </w:r>
+    </w:p>
+    <w:p>
+      <w:pPr>
+        <w:rPr>
+          <w:lang w:val="en-AU"/>
+        </w:rPr>
+      </w:pPr>
+      <w:r>
+        <w:rPr>
+          <w:lang w:val="en-AU"/>
+        </w:rPr>
+        <w:t xml:space="preserve">        </w:t>
+      </w:r>
+      <w:proofErr w:type="spellStart"/>
+      <w:proofErr w:type="gramStart"/>
+      <w:r>
+        <w:rPr>
+          <w:lang w:val="en-AU"/>
+        </w:rPr>
+        <w:t>self.state</w:t>
+      </w:r>
+      <w:proofErr w:type="spellEnd"/>
+      <w:proofErr w:type="gramEnd"/>
+      <w:r>
+        <w:rPr>
+          <w:lang w:val="en-AU"/>
+        </w:rPr>
+        <w:t xml:space="preserve"> = state</w:t>
+      </w:r>
+    </w:p>
+    <w:p>
+      <w:pPr>
+        <w:rPr>
+          <w:lang w:val="en-AU"/>
+        </w:rPr>
+      </w:pPr>
+    </w:p>
+    <w:p>
+      <w:pPr>
+        <w:rPr>
+          <w:lang w:val="en-AU"/>
+        </w:rPr>
+      </w:pPr>
+      <w:r>
+        <w:rPr>
+          <w:lang w:val="en-AU"/>
+        </w:rPr>
+        <w:t xml:space="preserve">    def </w:t>
+      </w:r>
+      <w:proofErr w:type="spellStart"/>
+      <w:proofErr w:type="gramStart"/>
+      <w:r>
+        <w:rPr>
+          <w:lang w:val="en-AU"/>
+        </w:rPr>
+        <w:t>hasAppointment</w:t>
+      </w:r>
+      <w:proofErr w:type="spellEnd"/>
+      <w:r>
+        <w:rPr>
+          <w:lang w:val="en-AU"/>
+        </w:rPr>
+        <w:t>(</w:t>
+      </w:r>
+      <w:proofErr w:type="gramEnd"/>
+      <w:r>
+        <w:rPr>
+          <w:lang w:val="en-AU"/>
+        </w:rPr>
+        <w:t>):</w:t>
+      </w:r>
+    </w:p>
+    <w:p>
+      <w:pPr>
+        <w:rPr>
+          <w:lang w:val="en-AU"/>
+        </w:rPr>
+      </w:pPr>
+      <w:r>
+        <w:rPr>
+          <w:lang w:val="en-AU"/>
+        </w:rPr>
+        <w:t>        pass</w:t>
+      </w:r>
+    </w:p>
+    <w:p>
+      <w:pPr>
+        <w:rPr>
+          <w:lang w:val="en-AU"/>
+        </w:rPr>
+      </w:pPr>
+    </w:p>
+    <w:p>
+      <w:pPr>
+        <w:rPr>
+          <w:lang w:val="en-AU"/>
+        </w:rPr>
+      </w:pPr>
+      <w:r>
+        <w:rPr>
+          <w:lang w:val="en-AU"/>
+        </w:rPr>
+        <w:t>class Practitioner:</w:t>
+      </w:r>
+    </w:p>
+    <w:p>
+      <w:pPr>
+        <w:rPr>
+          <w:lang w:val="en-AU"/>
+        </w:rPr>
+      </w:pPr>
+      <w:r>
+        <w:rPr>
+          <w:lang w:val="en-AU"/>
+        </w:rPr>
+        <w:t>    def __</w:t>
+      </w:r>
+      <w:proofErr w:type="spellStart"/>
+      <w:r>
+        <w:rPr>
+          <w:lang w:val="en-AU"/>
+        </w:rPr>
+        <w:t>init</w:t>
+      </w:r>
+      <w:proofErr w:type="spellEnd"/>
+      <w:r>
+        <w:rPr>
+          <w:lang w:val="en-AU"/>
+        </w:rPr>
+        <w:t>_</w:t>
+      </w:r>
+      <w:proofErr w:type="gramStart"/>
+      <w:r>
+        <w:rPr>
+          <w:lang w:val="en-AU"/>
+        </w:rPr>
+        <w:t>_(</w:t>
+      </w:r>
+      <w:proofErr w:type="gramEnd"/>
+      <w:r>
+        <w:rPr>
+          <w:lang w:val="en-AU"/>
+        </w:rPr>
+        <w:t xml:space="preserve">self, </w:t>
+      </w:r>
+      <w:proofErr w:type="spellStart"/>
+      <w:r>
+        <w:rPr>
+          <w:lang w:val="en-AU"/>
+        </w:rPr>
+        <w:t>firstName</w:t>
+      </w:r>
+      <w:proofErr w:type="spellEnd"/>
+      <w:r>
+        <w:rPr>
+          <w:lang w:val="en-AU"/>
+        </w:rPr>
+        <w:t xml:space="preserve">, </w:t>
+      </w:r>
+      <w:proofErr w:type="spellStart"/>
+      <w:r>
+        <w:rPr>
+          <w:lang w:val="en-AU"/>
+        </w:rPr>
+        <w:t>lastName</w:t>
+      </w:r>
+      <w:proofErr w:type="spellEnd"/>
+      <w:r>
+        <w:rPr>
+          <w:lang w:val="en-AU"/>
+        </w:rPr>
+        <w:t xml:space="preserve">, email, </w:t>
+      </w:r>
+      <w:proofErr w:type="spellStart"/>
+      <w:r>
+        <w:rPr>
+          <w:lang w:val="en-AU"/>
+        </w:rPr>
+        <w:t>phoneNumber</w:t>
+      </w:r>
+      <w:proofErr w:type="spellEnd"/>
+      <w:r>
+        <w:rPr>
+          <w:lang w:val="en-AU"/>
+        </w:rPr>
+        <w:t>):</w:t>
+      </w:r>
+    </w:p>
+    <w:p>
+      <w:pPr>
+        <w:rPr>
+          <w:lang w:val="en-AU"/>
+        </w:rPr>
+      </w:pPr>
+      <w:r>
+        <w:rPr>
+          <w:lang w:val="en-AU"/>
+        </w:rPr>
+        <w:t>        self.id = 0</w:t>
+      </w:r>
+    </w:p>
+    <w:p>
+      <w:pPr>
+        <w:rPr>
+          <w:lang w:val="en-AU"/>
+        </w:rPr>
+      </w:pPr>
+      <w:r>
+        <w:rPr>
+          <w:lang w:val="en-AU"/>
+        </w:rPr>
+        <w:t xml:space="preserve">        </w:t>
+      </w:r>
+      <w:proofErr w:type="spellStart"/>
+      <w:proofErr w:type="gramStart"/>
+      <w:r>
+        <w:rPr>
+          <w:lang w:val="en-AU"/>
+        </w:rPr>
+        <w:t>self.firstName</w:t>
+      </w:r>
+      <w:proofErr w:type="spellEnd"/>
+      <w:proofErr w:type="gramEnd"/>
+      <w:r>
+        <w:rPr>
+          <w:lang w:val="en-AU"/>
+        </w:rPr>
+        <w:t xml:space="preserve"> = </w:t>
+      </w:r>
+      <w:proofErr w:type="spellStart"/>
+      <w:r>
+        <w:rPr>
+          <w:lang w:val="en-AU"/>
+        </w:rPr>
+        <w:t>firstName</w:t>
+      </w:r>
+      <w:proofErr w:type="spellEnd"/>
+    </w:p>
+    <w:p>
+      <w:pPr>
+        <w:rPr>
+          <w:lang w:val="en-AU"/>
+        </w:rPr>
+      </w:pPr>
+      <w:r>
+        <w:rPr>
+          <w:lang w:val="en-AU"/>
+        </w:rPr>
+        <w:lastRenderedPageBreak/>
+        <w:t xml:space="preserve">        </w:t>
+      </w:r>
+      <w:proofErr w:type="spellStart"/>
+      <w:proofErr w:type="gramStart"/>
+      <w:r>
+        <w:rPr>
+          <w:lang w:val="en-AU"/>
+        </w:rPr>
+        <w:t>self.lastName</w:t>
+      </w:r>
+      <w:proofErr w:type="spellEnd"/>
+      <w:proofErr w:type="gramEnd"/>
+      <w:r>
+        <w:rPr>
+          <w:lang w:val="en-AU"/>
+        </w:rPr>
+        <w:t xml:space="preserve"> = </w:t>
+      </w:r>
+      <w:proofErr w:type="spellStart"/>
+      <w:r>
+        <w:rPr>
+          <w:lang w:val="en-AU"/>
+        </w:rPr>
+        <w:t>lastName</w:t>
+      </w:r>
+      <w:proofErr w:type="spellEnd"/>
+    </w:p>
+    <w:p>
+      <w:pPr>
+        <w:rPr>
+          <w:lang w:val="en-AU"/>
+        </w:rPr>
+      </w:pPr>
+      <w:r>
+        <w:rPr>
+          <w:lang w:val="en-AU"/>
+        </w:rPr>
+        <w:t xml:space="preserve">        </w:t>
+      </w:r>
+      <w:proofErr w:type="spellStart"/>
+      <w:proofErr w:type="gramStart"/>
+      <w:r>
+        <w:rPr>
+          <w:lang w:val="en-AU"/>
+        </w:rPr>
+        <w:t>self.email</w:t>
+      </w:r>
+      <w:proofErr w:type="spellEnd"/>
+      <w:proofErr w:type="gramEnd"/>
+      <w:r>
+        <w:rPr>
+          <w:lang w:val="en-AU"/>
+        </w:rPr>
+        <w:t xml:space="preserve"> = email</w:t>
+      </w:r>
+    </w:p>
+    <w:p>
+      <w:pPr>
+        <w:rPr>
+          <w:lang w:val="en-AU"/>
+        </w:rPr>
+      </w:pPr>
+      <w:r>
+        <w:rPr>
+          <w:lang w:val="en-AU"/>
+        </w:rPr>
+        <w:t xml:space="preserve">        </w:t>
+      </w:r>
+      <w:proofErr w:type="spellStart"/>
+      <w:proofErr w:type="gramStart"/>
+      <w:r>
+        <w:rPr>
+          <w:lang w:val="en-AU"/>
+        </w:rPr>
+        <w:t>self.phoneNumber</w:t>
+      </w:r>
+      <w:proofErr w:type="spellEnd"/>
+      <w:proofErr w:type="gramEnd"/>
+      <w:r>
+        <w:rPr>
+          <w:lang w:val="en-AU"/>
+        </w:rPr>
+        <w:t xml:space="preserve"> = </w:t>
+      </w:r>
+      <w:proofErr w:type="spellStart"/>
+      <w:r>
+        <w:rPr>
+          <w:lang w:val="en-AU"/>
+        </w:rPr>
+        <w:t>phoneNumber</w:t>
+      </w:r>
+      <w:proofErr w:type="spellEnd"/>
+    </w:p>
+    <w:p>
+      <w:pPr>
+        <w:rPr>
+          <w:lang w:val="en-AU"/>
+        </w:rPr>
+      </w:pPr>
+    </w:p>
+    <w:p>
+      <w:pPr>
+        <w:rPr>
+          <w:lang w:val="en-AU"/>
+        </w:rPr>
+      </w:pPr>
+      <w:r>
+        <w:rPr>
+          <w:lang w:val="en-AU"/>
+        </w:rPr>
+        <w:t xml:space="preserve">    def </w:t>
+      </w:r>
+      <w:proofErr w:type="spellStart"/>
+      <w:proofErr w:type="gramStart"/>
+      <w:r>
+        <w:rPr>
+          <w:lang w:val="en-AU"/>
+        </w:rPr>
+        <w:t>isAvailable</w:t>
+      </w:r>
+      <w:proofErr w:type="spellEnd"/>
+      <w:r>
+        <w:rPr>
+          <w:lang w:val="en-AU"/>
+        </w:rPr>
+        <w:t>(</w:t>
+      </w:r>
+      <w:proofErr w:type="gramEnd"/>
+      <w:r>
+        <w:rPr>
+          <w:lang w:val="en-AU"/>
+        </w:rPr>
+        <w:t>date, time):</w:t>
+      </w:r>
+    </w:p>
+    <w:p>
+      <w:pPr>
+        <w:rPr>
+          <w:lang w:val="en-AU"/>
+        </w:rPr>
+      </w:pPr>
+      <w:r>
+        <w:rPr>
+          <w:lang w:val="en-AU"/>
+        </w:rPr>
+        <w:t>        pass</w:t>
+      </w:r>
+    </w:p>
+    <w:p>
+      <w:pPr>
+        <w:rPr>
+          <w:lang w:val="en-AU"/>
+        </w:rPr>
+      </w:pPr>
+    </w:p>
+    <w:p>
+      <w:pPr>
+        <w:rPr>
+          <w:lang w:val="en-AU"/>
+        </w:rPr>
+      </w:pPr>
+      <w:r>
+        <w:rPr>
+          <w:lang w:val="en-AU"/>
+        </w:rPr>
+        <w:t>class Appointment:</w:t>
+      </w:r>
+    </w:p>
+    <w:p>
+      <w:pPr>
+        <w:rPr>
+          <w:lang w:val="en-AU"/>
+        </w:rPr>
+      </w:pPr>
+      <w:r>
+        <w:rPr>
+          <w:lang w:val="en-AU"/>
+        </w:rPr>
+        <w:t>    def __</w:t>
+      </w:r>
+      <w:proofErr w:type="spellStart"/>
+      <w:r>
+        <w:rPr>
+          <w:lang w:val="en-AU"/>
+        </w:rPr>
+        <w:t>init</w:t>
+      </w:r>
+      <w:proofErr w:type="spellEnd"/>
+      <w:r>
+        <w:rPr>
+          <w:lang w:val="en-AU"/>
+        </w:rPr>
+        <w:t>_</w:t>
+      </w:r>
+      <w:proofErr w:type="gramStart"/>
+      <w:r>
+        <w:rPr>
+          <w:lang w:val="en-AU"/>
+        </w:rPr>
+        <w:t>_(</w:t>
+      </w:r>
+      <w:proofErr w:type="gramEnd"/>
+      <w:r>
+        <w:rPr>
+          <w:lang w:val="en-AU"/>
+        </w:rPr>
+        <w:t xml:space="preserve">self, date, time, </w:t>
+      </w:r>
+      <w:proofErr w:type="spellStart"/>
+      <w:r>
+        <w:rPr>
+          <w:lang w:val="en-AU"/>
+        </w:rPr>
+        <w:t>forPatient</w:t>
+      </w:r>
+      <w:proofErr w:type="spellEnd"/>
+      <w:r>
+        <w:rPr>
+          <w:lang w:val="en-AU"/>
+        </w:rPr>
+        <w:t xml:space="preserve">, </w:t>
+      </w:r>
+      <w:proofErr w:type="spellStart"/>
+      <w:r>
+        <w:rPr>
+          <w:lang w:val="en-AU"/>
+        </w:rPr>
+        <w:t>withPractitioner</w:t>
+      </w:r>
+      <w:proofErr w:type="spellEnd"/>
+      <w:r>
+        <w:rPr>
+          <w:lang w:val="en-AU"/>
+        </w:rPr>
+        <w:t>):</w:t>
+      </w:r>
+    </w:p>
+    <w:p>
+      <w:pPr>
+        <w:rPr>
+          <w:lang w:val="en-AU"/>
+        </w:rPr>
+      </w:pPr>
+      <w:r>
+        <w:rPr>
+          <w:lang w:val="en-AU"/>
+        </w:rPr>
+        <w:t>        self.id = 0</w:t>
+      </w:r>
+    </w:p>
+    <w:p>
+      <w:pPr>
+        <w:rPr>
+          <w:lang w:val="en-AU"/>
+        </w:rPr>
+      </w:pPr>
+      <w:r>
+        <w:rPr>
+          <w:lang w:val="en-AU"/>
+        </w:rPr>
+        <w:t xml:space="preserve">        </w:t>
+      </w:r>
+      <w:proofErr w:type="spellStart"/>
+      <w:proofErr w:type="gramStart"/>
+      <w:r>
+        <w:rPr>
+          <w:lang w:val="en-AU"/>
+        </w:rPr>
+        <w:t>self.date</w:t>
+      </w:r>
+      <w:proofErr w:type="spellEnd"/>
+      <w:proofErr w:type="gramEnd"/>
+      <w:r>
+        <w:rPr>
+          <w:lang w:val="en-AU"/>
+        </w:rPr>
+        <w:t xml:space="preserve"> = date</w:t>
+      </w:r>
+    </w:p>
+    <w:p>
+      <w:pPr>
+        <w:rPr>
+          <w:lang w:val="en-AU"/>
+        </w:rPr>
+      </w:pPr>
+      <w:r>
+        <w:rPr>
+          <w:lang w:val="en-AU"/>
+        </w:rPr>
+        <w:t xml:space="preserve">        </w:t>
+      </w:r>
+      <w:proofErr w:type="spellStart"/>
+      <w:proofErr w:type="gramStart"/>
+      <w:r>
+        <w:rPr>
+          <w:lang w:val="en-AU"/>
+        </w:rPr>
+        <w:t>self.time</w:t>
+      </w:r>
+      <w:proofErr w:type="spellEnd"/>
+      <w:proofErr w:type="gramEnd"/>
+      <w:r>
+        <w:rPr>
+          <w:lang w:val="en-AU"/>
+        </w:rPr>
+        <w:t xml:space="preserve"> = time</w:t>
+      </w:r>
+    </w:p>
+    <w:p>
+      <w:pPr>
+        <w:rPr>
+          <w:lang w:val="en-AU"/>
+        </w:rPr>
+      </w:pPr>
+      <w:r>
+        <w:rPr>
+          <w:lang w:val="en-AU"/>
+        </w:rPr>
+        <w:t xml:space="preserve">        </w:t>
+      </w:r>
+      <w:proofErr w:type="spellStart"/>
+      <w:proofErr w:type="gramStart"/>
+      <w:r>
+        <w:rPr>
+          <w:lang w:val="en-AU"/>
+        </w:rPr>
+        <w:t>self.forPatient</w:t>
+      </w:r>
+      <w:proofErr w:type="spellEnd"/>
+      <w:proofErr w:type="gramEnd"/>
+      <w:r>
+        <w:rPr>
+          <w:lang w:val="en-AU"/>
+        </w:rPr>
+        <w:t xml:space="preserve"> = </w:t>
+      </w:r>
+      <w:proofErr w:type="spellStart"/>
+      <w:r>
+        <w:rPr>
+          <w:lang w:val="en-AU"/>
+        </w:rPr>
+        <w:t>forPatient</w:t>
+      </w:r>
+      <w:proofErr w:type="spellEnd"/>
+    </w:p>
+    <w:p>
+      <w:pPr>
+        <w:rPr>
+          <w:lang w:val="en-AU"/>
+        </w:rPr>
+      </w:pPr>
+      <w:r>
+        <w:rPr>
+          <w:lang w:val="en-AU"/>
+        </w:rPr>
+        <w:t xml:space="preserve">        </w:t>
+      </w:r>
+      <w:proofErr w:type="spellStart"/>
+      <w:proofErr w:type="gramStart"/>
+      <w:r>
+        <w:rPr>
+          <w:lang w:val="en-AU"/>
+        </w:rPr>
+        <w:t>self.withPractitioner</w:t>
+      </w:r>
+      <w:proofErr w:type="spellEnd"/>
+      <w:proofErr w:type="gramEnd"/>
+      <w:r>
+        <w:rPr>
+          <w:lang w:val="en-AU"/>
+        </w:rPr>
+        <w:t xml:space="preserve"> = </w:t>
+      </w:r>
+      <w:proofErr w:type="spellStart"/>
+      <w:r>
+        <w:rPr>
+          <w:lang w:val="en-AU"/>
+        </w:rPr>
+        <w:t>withPractitioner</w:t>
+      </w:r>
+      <w:proofErr w:type="spellEnd"/>
+    </w:p>
+    <w:p>
+      <w:pPr>
+        <w:rPr>
+          <w:lang w:val="en-AU"/>
+        </w:rPr>
+      </w:pPr>
+    </w:p>
+    <w:p>
+      <w:pPr>
+        <w:rPr>
+          <w:lang w:val="en-AU"/>
+        </w:rPr>
+      </w:pPr>
+      <w:r>
+        <w:rPr>
+          <w:lang w:val="en-AU"/>
+        </w:rPr>
+        <w:t xml:space="preserve">    def </w:t>
+      </w:r>
+      <w:proofErr w:type="gramStart"/>
+      <w:r>
+        <w:rPr>
+          <w:lang w:val="en-AU"/>
+        </w:rPr>
+        <w:t>cancel(</w:t>
+      </w:r>
+      <w:proofErr w:type="gramEnd"/>
+      <w:r>
+        <w:rPr>
+          <w:lang w:val="en-AU"/>
+        </w:rPr>
+        <w:t>):</w:t>
+      </w:r>
+    </w:p>
+    <w:p>
+      <w:pPr>
+        <w:rPr>
+          <w:lang w:val="en-AU"/>
+        </w:rPr>
+      </w:pPr>
+      <w:r>
+        <w:rPr>
+          <w:lang w:val="en-AU"/>
+        </w:rPr>
+        <w:t>        pass</w:t>
+      </w:r>
+    </w:p>
+    <w:p>
+      <w:pPr>
+        <w:rPr>
+          <w:lang w:val="en-AU"/>
+        </w:rPr>
+      </w:pPr>
+    </w:p>
+    <w:p>
+      <w:pPr>
+        <w:rPr>
+          <w:lang w:val="en-AU"/>
+        </w:rPr>
+      </w:pPr>
+      <w:r>
+        <w:rPr>
+          <w:lang w:val="en-AU"/>
+        </w:rPr>
+        <w:t>class Clinic:</w:t>
+      </w:r>
+    </w:p>
+    <w:p>
+      <w:pPr>
+        <w:rPr>
+          <w:lang w:val="en-AU"/>
+        </w:rPr>
+      </w:pPr>
+      <w:r>
+        <w:rPr>
+          <w:lang w:val="en-AU"/>
+        </w:rPr>
+        <w:t xml:space="preserve">    def </w:t>
+      </w:r>
+      <w:proofErr w:type="spellStart"/>
+      <w:proofErr w:type="gramStart"/>
+      <w:r>
+        <w:rPr>
+          <w:lang w:val="en-AU"/>
+        </w:rPr>
+        <w:t>createAppointment</w:t>
+      </w:r>
+      <w:proofErr w:type="spellEnd"/>
+      <w:r>
+        <w:rPr>
+          <w:lang w:val="en-AU"/>
+        </w:rPr>
+        <w:t>(</w:t>
+      </w:r>
+      <w:proofErr w:type="gramEnd"/>
+      <w:r>
+        <w:rPr>
+          <w:lang w:val="en-AU"/>
+        </w:rPr>
+        <w:t>date, time, patient, practitioner):</w:t>
+      </w:r>
+    </w:p>
+    <w:p>
+      <w:pPr>
+        <w:rPr>
+          <w:lang w:val="en-AU"/>
+        </w:rPr>
+      </w:pPr>
+      <w:r>
+        <w:rPr>
+          <w:lang w:val="en-AU"/>
+        </w:rPr>
+        <w:t>        pass</w:t>
+      </w:r>
+    </w:p>
+    <w:p>
+      <w:pPr>
+        <w:rPr>
+          <w:lang w:val="en-AU"/>
+        </w:rPr>
+      </w:pPr>
+    </w:p>
+    <w:p>
+      <w:pPr>
+        <w:rPr>
+          <w:lang w:val="en-AU"/>
+        </w:rPr>
+      </w:pPr>
+      <w:r>
+        <w:rPr>
+          <w:lang w:val="en-AU"/>
+        </w:rPr>
+        <w:t xml:space="preserve">    def </w:t>
+      </w:r>
+      <w:proofErr w:type="spellStart"/>
+      <w:r>
+        <w:rPr>
+          <w:lang w:val="en-AU"/>
+        </w:rPr>
+        <w:t>deleteAppointment</w:t>
+      </w:r>
+      <w:proofErr w:type="spellEnd"/>
+      <w:r>
+        <w:rPr>
+          <w:lang w:val="en-AU"/>
+        </w:rPr>
+        <w:t>(appointment):</w:t>
+      </w:r>
+    </w:p>
+    <w:p>
+      <w:pPr>
+        <w:rPr>
+          <w:lang w:val="en-AU"/>
+        </w:rPr>
+      </w:pPr>
+      <w:r>
+        <w:rPr>
+          <w:lang w:val="en-AU"/>
+        </w:rPr>
+        <w:t>        pass</w:t>
+      </w:r>
+    </w:p>
+    <w:p>
+      <w:pPr>
+        <w:rPr>
+          <w:lang w:val="en-AU"/>
+        </w:rPr>
+      </w:pPr>
+    </w:p>
+    <w:p>
+      <w:pPr>
+        <w:rPr>
+          <w:lang w:val="en-AU"/>
+        </w:rPr>
+      </w:pPr>
+      <w:r>
+        <w:rPr>
+          <w:lang w:val="en-AU"/>
+        </w:rPr>
+        <w:t xml:space="preserve">    def </w:t>
+      </w:r>
+      <w:proofErr w:type="spellStart"/>
+      <w:proofErr w:type="gramStart"/>
+      <w:r>
+        <w:rPr>
+          <w:lang w:val="en-AU"/>
+        </w:rPr>
+        <w:t>viewAppointments</w:t>
+      </w:r>
+      <w:proofErr w:type="spellEnd"/>
+      <w:r>
+        <w:rPr>
+          <w:lang w:val="en-AU"/>
+        </w:rPr>
+        <w:t>(</w:t>
+      </w:r>
+      <w:proofErr w:type="gramEnd"/>
+      <w:r>
+        <w:rPr>
+          <w:lang w:val="en-AU"/>
+        </w:rPr>
+        <w:t>):</w:t>
+      </w:r>
+    </w:p>
+    <w:p>
+      <w:pPr>
+        <w:rPr>
+          <w:lang w:val="en-AU"/>
+        </w:rPr>
+      </w:pPr>
+      <w:r>
+        <w:rPr>
+          <w:lang w:val="en-AU"/>
+        </w:rPr>
+        <w:t>        pass</w:t>
+      </w:r>
+    </w:p>
+    <w:p>
+      <w:pPr>
+        <w:rPr>
+          <w:lang w:val="en-AU"/>
+        </w:rPr>
+      </w:pPr>
+    </w:p>
+    <w:p>
+      <w:pPr>
+        <w:rPr>
+          <w:lang w:val="en-AU"/>
+        </w:rPr>
+      </w:pPr>
+      <w:r>
+        <w:rPr>
+          <w:lang w:val="en-AU"/>
+        </w:rPr>
+        <w:lastRenderedPageBreak/>
+        <w:t xml:space="preserve">    def </w:t>
+      </w:r>
+      <w:proofErr w:type="spellStart"/>
+      <w:proofErr w:type="gramStart"/>
+      <w:r>
+        <w:rPr>
+          <w:lang w:val="en-AU"/>
+        </w:rPr>
+        <w:t>editAppointment</w:t>
+      </w:r>
+      <w:proofErr w:type="spellEnd"/>
+      <w:r>
+        <w:rPr>
+          <w:lang w:val="en-AU"/>
+        </w:rPr>
+        <w:t>(</w:t>
+      </w:r>
+      <w:proofErr w:type="gramEnd"/>
+      <w:r>
+        <w:rPr>
+          <w:lang w:val="en-AU"/>
+        </w:rPr>
+        <w:t xml:space="preserve">appointment, date, time, </w:t>
+      </w:r>
+      <w:proofErr w:type="spellStart"/>
+      <w:r>
+        <w:rPr>
+          <w:lang w:val="en-AU"/>
+        </w:rPr>
+        <w:t>forPatient</w:t>
+      </w:r>
+      <w:proofErr w:type="spellEnd"/>
+      <w:r>
+        <w:rPr>
+          <w:lang w:val="en-AU"/>
+        </w:rPr>
+        <w:t xml:space="preserve">, </w:t>
+      </w:r>
+      <w:proofErr w:type="spellStart"/>
+      <w:r>
+        <w:rPr>
+          <w:lang w:val="en-AU"/>
+        </w:rPr>
+        <w:t>withPractitioner</w:t>
+      </w:r>
+      <w:proofErr w:type="spellEnd"/>
+      <w:r>
+        <w:rPr>
+          <w:lang w:val="en-AU"/>
+        </w:rPr>
+        <w:t>):</w:t>
+      </w:r>
+    </w:p>
+    <w:p>
+      <w:pPr>
+        <w:rPr>
+          <w:lang w:val="en-AU"/>
+        </w:rPr>
+      </w:pPr>
+      <w:r>
+        <w:rPr>
+          <w:lang w:val="en-AU"/>
+        </w:rPr>
+        <w:t>        pass</w:t>
+      </w:r>
+    </w:p>
+    <w:p>
+      <w:pPr>
+        <w:rPr>
+          <w:lang w:val="en-AU"/>
+        </w:rPr>
+      </w:pPr>
+    </w:p>
+    <w:p>
+      <w:pPr>
+        <w:rPr>
+          <w:lang w:val="en-AU"/>
+        </w:rPr>
+      </w:pPr>
+      <w:r>
+        <w:rPr>
+          <w:lang w:val="en-AU"/>
+        </w:rPr>
+        <w:t xml:space="preserve">    def </w:t>
+      </w:r>
+      <w:proofErr w:type="spellStart"/>
+      <w:r>
+        <w:rPr>
+          <w:lang w:val="en-AU"/>
+        </w:rPr>
+        <w:t>searchAppointments</w:t>
+      </w:r>
+      <w:proofErr w:type="spellEnd"/>
+      <w:r>
+        <w:rPr>
+          <w:lang w:val="en-AU"/>
+        </w:rPr>
+        <w:t>(date):</w:t>
+      </w:r>
+    </w:p>
+    <w:p>
+      <w:pPr>
+        <w:rPr>
+          <w:lang w:val="en-AU"/>
+        </w:rPr>
+      </w:pPr>
+      <w:r>
+        <w:rPr>
+          <w:lang w:val="en-AU"/>
+        </w:rPr>
+        <w:t>        pass</w:t>
+      </w:r>
+    </w:p>
+    <w:p>
+      <w:pPr>
+        <w:rPr>
+          <w:lang w:val="en-AU"/>
+        </w:rPr>
+      </w:pPr>
+    </w:p>
+    <w:p>
+      <w:pPr>
+        <w:rPr>
+          <w:lang w:val="en-AU"/>
+        </w:rPr>
+      </w:pPr>
+      <w:r>
+        <w:rPr>
+          <w:lang w:val="en-AU"/>
+        </w:rPr>
+        <w:t>class Database:</w:t>
+      </w:r>
+    </w:p>
+    <w:p>
+      <w:pPr>
+        <w:rPr>
+          <w:lang w:val="en-AU"/>
+        </w:rPr>
+      </w:pPr>
+      <w:r>
+        <w:rPr>
+          <w:lang w:val="en-AU"/>
+        </w:rPr>
+        <w:t>    def __</w:t>
+      </w:r>
+      <w:proofErr w:type="spellStart"/>
+      <w:r>
+        <w:rPr>
+          <w:lang w:val="en-AU"/>
+        </w:rPr>
+        <w:t>init</w:t>
+      </w:r>
+      <w:proofErr w:type="spellEnd"/>
+      <w:r>
+        <w:rPr>
+          <w:lang w:val="en-AU"/>
+        </w:rPr>
+        <w:t>_</w:t>
+      </w:r>
+      <w:proofErr w:type="gramStart"/>
+      <w:r>
+        <w:rPr>
+          <w:lang w:val="en-AU"/>
+        </w:rPr>
+        <w:t>_(</w:t>
+      </w:r>
+      <w:proofErr w:type="gramEnd"/>
+      <w:r>
+        <w:rPr>
+          <w:lang w:val="en-AU"/>
+        </w:rPr>
+        <w:t xml:space="preserve">self, </w:t>
+      </w:r>
+      <w:proofErr w:type="spellStart"/>
+      <w:r>
+        <w:rPr>
+          <w:lang w:val="en-AU"/>
+        </w:rPr>
+        <w:t>dataBaseName</w:t>
+      </w:r>
+      <w:proofErr w:type="spellEnd"/>
+      <w:r>
+        <w:rPr>
+          <w:lang w:val="en-AU"/>
+        </w:rPr>
+        <w:t>):</w:t>
+      </w:r>
+    </w:p>
+    <w:p>
+      <w:pPr>
+        <w:rPr>
+          <w:lang w:val="en-AU"/>
+        </w:rPr>
+      </w:pPr>
+      <w:r>
+        <w:rPr>
+          <w:lang w:val="en-AU"/>
+        </w:rPr>
+        <w:t xml:space="preserve">        </w:t>
+      </w:r>
+      <w:proofErr w:type="spellStart"/>
+      <w:proofErr w:type="gramStart"/>
+      <w:r>
+        <w:rPr>
+          <w:lang w:val="en-AU"/>
+        </w:rPr>
+        <w:t>self.dataBaseName</w:t>
+      </w:r>
+      <w:proofErr w:type="spellEnd"/>
+      <w:proofErr w:type="gramEnd"/>
+      <w:r>
+        <w:rPr>
+          <w:lang w:val="en-AU"/>
+        </w:rPr>
+        <w:t xml:space="preserve"> = </w:t>
+      </w:r>
+      <w:proofErr w:type="spellStart"/>
+      <w:r>
+        <w:rPr>
+          <w:lang w:val="en-AU"/>
+        </w:rPr>
+        <w:t>dataBaseName</w:t>
+      </w:r>
+      <w:proofErr w:type="spellEnd"/>
+    </w:p>
+    <w:p>
+      <w:pPr>
+        <w:rPr>
+          <w:lang w:val="en-AU"/>
+        </w:rPr>
+      </w:pPr>
+    </w:p>
+    <w:p>
+      <w:pPr>
+        <w:rPr>
+          <w:lang w:val="en-AU"/>
+        </w:rPr>
+      </w:pPr>
+      <w:r>
+        <w:rPr>
+          <w:lang w:val="en-AU"/>
+        </w:rPr>
+        <w:t xml:space="preserve">    def </w:t>
+      </w:r>
+      <w:proofErr w:type="spellStart"/>
+      <w:proofErr w:type="gramStart"/>
+      <w:r>
+        <w:rPr>
+          <w:lang w:val="en-AU"/>
+        </w:rPr>
+        <w:t>createRecord</w:t>
+      </w:r>
+      <w:proofErr w:type="spellEnd"/>
+      <w:r>
+        <w:rPr>
+          <w:lang w:val="en-AU"/>
+        </w:rPr>
+        <w:t>(</w:t>
+      </w:r>
+      <w:proofErr w:type="gramEnd"/>
+      <w:r>
+        <w:rPr>
+          <w:lang w:val="en-AU"/>
+        </w:rPr>
+        <w:t>):</w:t>
+      </w:r>
+    </w:p>
+    <w:p>
+      <w:pPr>
+        <w:rPr>
+          <w:lang w:val="en-AU"/>
+        </w:rPr>
+      </w:pPr>
+      <w:r>
+        <w:rPr>
+          <w:lang w:val="en-AU"/>
+        </w:rPr>
+        <w:t>        pass</w:t>
+      </w:r>
+    </w:p>
+    <w:p>
+      <w:pPr>
+        <w:rPr>
+          <w:lang w:val="en-AU"/>
+        </w:rPr>
+      </w:pPr>
+    </w:p>
+    <w:p>
+      <w:pPr>
+        <w:rPr>
+          <w:lang w:val="en-AU"/>
+        </w:rPr>
+      </w:pPr>
+      <w:r>
+        <w:rPr>
+          <w:lang w:val="en-AU"/>
+        </w:rPr>
+        <w:t xml:space="preserve">    def </w:t>
+      </w:r>
+      <w:proofErr w:type="spellStart"/>
+      <w:proofErr w:type="gramStart"/>
+      <w:r>
+        <w:rPr>
+          <w:lang w:val="en-AU"/>
+        </w:rPr>
+        <w:t>deleteRecord</w:t>
+      </w:r>
+      <w:proofErr w:type="spellEnd"/>
+      <w:r>
+        <w:rPr>
+          <w:lang w:val="en-AU"/>
+        </w:rPr>
+        <w:t>(</w:t>
+      </w:r>
+      <w:proofErr w:type="gramEnd"/>
+      <w:r>
+        <w:rPr>
+          <w:lang w:val="en-AU"/>
+        </w:rPr>
+        <w:t>):</w:t>
+      </w:r>
+    </w:p>
+    <w:p>
+      <w:pPr>
+        <w:rPr>
+          <w:lang w:val="en-AU"/>
+        </w:rPr>
+      </w:pPr>
+      <w:r>
+        <w:rPr>
+          <w:lang w:val="en-AU"/>
+        </w:rPr>
+        <w:t>        pass</w:t>
+      </w:r>
+    </w:p>
+    <w:p>
+      <w:pPr>
+        <w:rPr>
+          <w:lang w:val="en-AU"/>
+        </w:rPr>
+      </w:pPr>
+    </w:p>
+    <w:p>
+      <w:pPr>
+        <w:rPr>
+          <w:lang w:val="en-AU"/>
+        </w:rPr>
+      </w:pPr>
+      <w:r>
+        <w:rPr>
+          <w:lang w:val="en-AU"/>
+        </w:rPr>
+        <w:t xml:space="preserve">    def </w:t>
+      </w:r>
+      <w:proofErr w:type="spellStart"/>
+      <w:proofErr w:type="gramStart"/>
+      <w:r>
+        <w:rPr>
+          <w:lang w:val="en-AU"/>
+        </w:rPr>
+        <w:t>editRecord</w:t>
+      </w:r>
+      <w:proofErr w:type="spellEnd"/>
+      <w:r>
+        <w:rPr>
+          <w:lang w:val="en-AU"/>
+        </w:rPr>
+        <w:t>(</w:t>
+      </w:r>
+      <w:proofErr w:type="gramEnd"/>
+      <w:r>
+        <w:rPr>
+          <w:lang w:val="en-AU"/>
+        </w:rPr>
+        <w:t>):</w:t>
+      </w:r>
+    </w:p>
+    <w:p>
+      <w:pPr>
+        <w:rPr>
+          <w:lang w:val="en-AU"/>
+        </w:rPr>
+      </w:pPr>
+      <w:r>
+        <w:rPr>
+          <w:lang w:val="en-AU"/>
+        </w:rPr>
+        <w:t>        pass</w:t>
+      </w:r>
+    </w:p>
+    <w:p/>
+    <w:p>
+      <w:pPr>
+        <w:pStyle w:val="Heading1"/>
+      </w:pPr>
+      <w:r>
+        <w:t>H - Consistency Check</w:t>
+      </w:r>
+    </w:p>
+    <w:p>
+      <w:r>
+        <w:t xml:space="preserve">Check model-code consistency; do not implement full </w:t>
+      </w:r>
+      <w:proofErr w:type="spellStart"/>
+      <w:r>
+        <w:t>behaviour</w:t>
+      </w:r>
+      <w:proofErr w:type="spellEnd"/>
+      <w:r>
+        <w:t xml:space="preserve"> yet.</w:t>
       </w:r>
     </w:p>
     <w:p>
@@ -177,7 +2427,7 @@
 </file>
 
 <file path=word/numbering.xml><?xml version="1.0" encoding="utf-8"?>
-<w:numbering xmlns:wpc="http://schemas.microsoft.com/office/word/2010/wordprocessingCanvas" xmlns:cx="http://schemas.microsoft.com/office/drawing/2014/chartex" xmlns:cx1="http://schemas.microsoft.com/office/drawing/2015/9/8/chartex" xmlns:cx2="http://schemas.microsoft.com/office/drawing/2015/10/21/chartex" xmlns:cx3="http://schemas.microsoft.com/office/drawing/2016/5/9/chartex" xmlns:cx4="http://schemas.microsoft.com/office/drawing/2016/5/10/chartex" xmlns:cx5="http://schemas.microsoft.com/office/drawing/2016/5/11/chartex" xmlns:cx6="http://schemas.microsoft.com/office/drawing/2016/5/12/chartex" xmlns:cx7="http://schemas.microsoft.com/office/drawing/2016/5/13/chartex" xmlns:cx8="http://schemas.microsoft.com/office/drawing/2016/5/14/chartex" xmlns:mc="http://schemas.openxmlformats.org/markup-compatibility/2006" xmlns:aink="http://schemas.microsoft.com/office/drawing/2016/ink" xmlns:am3d="http://schemas.microsoft.com/office/drawing/2017/model3d" xmlns:o="urn:schemas-microsoft-com:office:office" xmlns:oel="http://schemas.microsoft.com/office/2019/extlst" xmlns:r="http://schemas.openxmlformats.org/officeDocument/2006/relationships" xmlns:m="http://schemas.openxmlformats.org/officeDocument/2006/math" xmlns:v="urn:schemas-microsoft-com:vml" xmlns:wp14="http://schemas.microsoft.com/office/word/2010/wordprocessingDrawing" xmlns:wp="http://schemas.openxmlformats.org/drawingml/2006/wordprocessingDrawing" xmlns:w10="urn:schemas-microsoft-com:office:word" xmlns:w="http://schemas.openxmlformats.org/wordprocessingml/2006/main" xmlns:w14="http://schemas.microsoft.com/office/word/2010/wordml" xmlns:w15="http://schemas.microsoft.com/office/word/2012/wordml" xmlns:w16cei="http://schemas.microsoft.com/office/word/2026/wordml/cei" xmlns:w16cex="http://schemas.microsoft.com/office/word/2018/wordml/cex" xmlns:w16cid="http://schemas.microsoft.com/office/word/2016/wordml/cid" xmlns:w16="http://schemas.microsoft.com/office/word/2018/wordml" xmlns:w16du="http://schemas.microsoft.com/office/word/2023/wordml/word16du" xmlns:w16sdtdh="http://schemas.microsoft.com/office/word/2020/wordml/sdtdatahash" xmlns:w16sdtfl="http://schemas.microsoft.com/office/word/2024/wordml/sdtformatlock" xmlns:w16se="http://schemas.microsoft.com/office/word/2015/wordml/symex" xmlns:wpg="http://schemas.microsoft.com/office/word/2010/wordprocessingGroup" xmlns:wpi="http://schemas.microsoft.com/office/word/2010/wordprocessingInk" xmlns:wne="http://schemas.microsoft.com/office/word/2006/wordml" xmlns:wps="http://schemas.microsoft.com/office/word/2010/wordprocessingShape" mc:Ignorable="w14 w15 w16se w16cid w16 w16cex w16sdtdh w16sdtfl w16du wp14">
+<w:numbering xmlns:wpc="http://schemas.microsoft.com/office/word/2010/wordprocessingCanvas" xmlns:cx="http://schemas.microsoft.com/office/drawing/2014/chartex" xmlns:cx1="http://schemas.microsoft.com/office/drawing/2015/9/8/chartex" xmlns:cx2="http://schemas.microsoft.com/office/drawing/2015/10/21/chartex" xmlns:cx3="http://schemas.microsoft.com/office/drawing/2016/5/9/chartex" xmlns:cx4="http://schemas.microsoft.com/office/drawing/2016/5/10/chartex" xmlns:cx5="http://schemas.microsoft.com/office/drawing/2016/5/11/chartex" xmlns:cx6="http://schemas.microsoft.com/office/drawing/2016/5/12/chartex" xmlns:cx7="http://schemas.microsoft.com/office/drawing/2016/5/13/chartex" xmlns:cx8="http://schemas.microsoft.com/office/drawing/2016/5/14/chartex" xmlns:mc="http://schemas.openxmlformats.org/markup-compatibility/2006" xmlns:aink="http://schemas.microsoft.com/office/drawing/2016/ink" xmlns:am3d="http://schemas.microsoft.com/office/drawing/2017/model3d" xmlns:o="urn:schemas-microsoft-com:office:office" xmlns:oel="http://schemas.microsoft.com/office/2019/extlst" xmlns:r="http://schemas.openxmlformats.org/officeDocument/2006/relationships" xmlns:m="http://schemas.openxmlformats.org/officeDocument/2006/math" xmlns:v="urn:schemas-microsoft-com:vml" xmlns:wp14="http://schemas.microsoft.com/office/word/2010/wordprocessingDrawing" xmlns:wp="http://schemas.openxmlformats.org/drawingml/2006/wordprocessingDrawing" xmlns:w10="urn:schemas-microsoft-com:office:word" xmlns:w="http://schemas.openxmlformats.org/wordprocessingml/2006/main" xmlns:w14="http://schemas.microsoft.com/office/word/2010/wordml" xmlns:w15="http://schemas.microsoft.com/office/word/2012/wordml" xmlns:w16cex="http://schemas.microsoft.com/office/word/2018/wordml/cex" xmlns:w16cid="http://schemas.microsoft.com/office/word/2016/wordml/cid" xmlns:w16="http://schemas.microsoft.com/office/word/2018/wordml" xmlns:w16du="http://schemas.microsoft.com/office/word/2023/wordml/word16du" xmlns:w16sdtdh="http://schemas.microsoft.com/office/word/2020/wordml/sdtdatahash" xmlns:w16sdtfl="http://schemas.microsoft.com/office/word/2024/wordml/sdtformatlock" xmlns:w16se="http://schemas.microsoft.com/office/word/2015/wordml/symex" xmlns:wpg="http://schemas.microsoft.com/office/word/2010/wordprocessingGroup" xmlns:wpi="http://schemas.microsoft.com/office/word/2010/wordprocessingInk" xmlns:wne="http://schemas.microsoft.com/office/word/2006/wordml" xmlns:wps="http://schemas.microsoft.com/office/word/2010/wordprocessingShape" mc:Ignorable="w14 w15 w16se w16cid w16 w16cex w16sdtdh w16sdtfl w16du wp14">
   <w:abstractNum w:abstractNumId="0" w15:restartNumberingAfterBreak="0">
     <w:nsid w:val="FFFFFF7C"/>
     <w:multiLevelType w:val="singleLevel"/>
@@ -346,6 +2596,119 @@
       </w:pPr>
       <w:rPr>
         <w:rFonts w:ascii="Symbol" w:hAnsi="Symbol" w:hint="default"/>
+      </w:rPr>
+    </w:lvl>
+  </w:abstractNum>
+  <w:abstractNum w:abstractNumId="9" w15:restartNumberingAfterBreak="0">
+    <w:nsid w:val="67BB3A88"/>
+    <w:multiLevelType w:val="hybridMultilevel"/>
+    <w:tmpl w:val="4EDA68A2"/>
+    <w:lvl w:ilvl="0" w:tplc="90A81962">
+      <w:start w:val="1"/>
+      <w:numFmt w:val="bullet"/>
+      <w:lvlText w:val=""/>
+      <w:lvlJc w:val="left"/>
+      <w:pPr>
+        <w:ind w:left="720" w:hanging="360"/>
+      </w:pPr>
+      <w:rPr>
+        <w:rFonts w:ascii="Symbol" w:eastAsiaTheme="minorEastAsia" w:hAnsi="Symbol" w:cstheme="minorBidi" w:hint="default"/>
+      </w:rPr>
+    </w:lvl>
+    <w:lvl w:ilvl="1" w:tplc="0C090003" w:tentative="1">
+      <w:start w:val="1"/>
+      <w:numFmt w:val="bullet"/>
+      <w:lvlText w:val="o"/>
+      <w:lvlJc w:val="left"/>
+      <w:pPr>
+        <w:ind w:left="1440" w:hanging="360"/>
+      </w:pPr>
+      <w:rPr>
+        <w:rFonts w:ascii="Courier New" w:hAnsi="Courier New" w:cs="Courier New" w:hint="default"/>
+      </w:rPr>
+    </w:lvl>
+    <w:lvl w:ilvl="2" w:tplc="0C090005" w:tentative="1">
+      <w:start w:val="1"/>
+      <w:numFmt w:val="bullet"/>
+      <w:lvlText w:val=""/>
+      <w:lvlJc w:val="left"/>
+      <w:pPr>
+        <w:ind w:left="2160" w:hanging="360"/>
+      </w:pPr>
+      <w:rPr>
+        <w:rFonts w:ascii="Wingdings" w:hAnsi="Wingdings" w:hint="default"/>
+      </w:rPr>
+    </w:lvl>
+    <w:lvl w:ilvl="3" w:tplc="0C090001" w:tentative="1">
+      <w:start w:val="1"/>
+      <w:numFmt w:val="bullet"/>
+      <w:lvlText w:val=""/>
+      <w:lvlJc w:val="left"/>
+      <w:pPr>
+        <w:ind w:left="2880" w:hanging="360"/>
+      </w:pPr>
+      <w:rPr>
+        <w:rFonts w:ascii="Symbol" w:hAnsi="Symbol" w:hint="default"/>
+      </w:rPr>
+    </w:lvl>
+    <w:lvl w:ilvl="4" w:tplc="0C090003" w:tentative="1">
+      <w:start w:val="1"/>
+      <w:numFmt w:val="bullet"/>
+      <w:lvlText w:val="o"/>
+      <w:lvlJc w:val="left"/>
+      <w:pPr>
+        <w:ind w:left="3600" w:hanging="360"/>
+      </w:pPr>
+      <w:rPr>
+        <w:rFonts w:ascii="Courier New" w:hAnsi="Courier New" w:cs="Courier New" w:hint="default"/>
+      </w:rPr>
+    </w:lvl>
+    <w:lvl w:ilvl="5" w:tplc="0C090005" w:tentative="1">
+      <w:start w:val="1"/>
+      <w:numFmt w:val="bullet"/>
+      <w:lvlText w:val=""/>
+      <w:lvlJc w:val="left"/>
+      <w:pPr>
+        <w:ind w:left="4320" w:hanging="360"/>
+      </w:pPr>
+      <w:rPr>
+        <w:rFonts w:ascii="Wingdings" w:hAnsi="Wingdings" w:hint="default"/>
+      </w:rPr>
+    </w:lvl>
+    <w:lvl w:ilvl="6" w:tplc="0C090001" w:tentative="1">
+      <w:start w:val="1"/>
+      <w:numFmt w:val="bullet"/>
+      <w:lvlText w:val=""/>
+      <w:lvlJc w:val="left"/>
+      <w:pPr>
+        <w:ind w:left="5040" w:hanging="360"/>
+      </w:pPr>
+      <w:rPr>
+        <w:rFonts w:ascii="Symbol" w:hAnsi="Symbol" w:hint="default"/>
+      </w:rPr>
+    </w:lvl>
+    <w:lvl w:ilvl="7" w:tplc="0C090003" w:tentative="1">
+      <w:start w:val="1"/>
+      <w:numFmt w:val="bullet"/>
+      <w:lvlText w:val="o"/>
+      <w:lvlJc w:val="left"/>
+      <w:pPr>
+        <w:ind w:left="5760" w:hanging="360"/>
+      </w:pPr>
+      <w:rPr>
+        <w:rFonts w:ascii="Courier New" w:hAnsi="Courier New" w:cs="Courier New" w:hint="default"/>
+      </w:rPr>
+    </w:lvl>
+    <w:lvl w:ilvl="8" w:tplc="0C090005" w:tentative="1">
+      <w:start w:val="1"/>
+      <w:numFmt w:val="bullet"/>
+      <w:lvlText w:val=""/>
+      <w:lvlJc w:val="left"/>
+      <w:pPr>
+        <w:ind w:left="6480" w:hanging="360"/>
+      </w:pPr>
+      <w:rPr>
+        <w:rFonts w:ascii="Wingdings" w:hAnsi="Wingdings" w:hint="default"/>
       </w:rPr>
     </w:lvl>
   </w:abstractNum>
@@ -375,6 +2738,9 @@
   </w:num>
   <w:num w:numId="9" w16cid:durableId="745299821">
     <w:abstractNumId w:val="0"/>
+  </w:num>
+  <w:num w:numId="10" w16cid:durableId="988560703">
+    <w:abstractNumId w:val="9"/>
   </w:num>
 </w:numbering>
 </file>
@@ -986,7 +3352,6 @@
   <w:style w:type="character" w:default="1" w:styleId="DefaultParagraphFont">
     <w:name w:val="Default Paragraph Font"/>
     <w:uiPriority w:val="1"/>
-    <w:semiHidden/>
     <w:unhideWhenUsed/>
   </w:style>
   <w:style w:type="table" w:default="1" w:styleId="TableNormal">

</xml_diff>